<commit_message>
docs: URL https://ai-nieuws.onrender.com/ toegevoegd op 4 plekken
Live-versie van de tool was nergens vastgelegd. Toegevoegd:
- projectlog.md sectie 3 (Hosting Render): placeholder gevuld
- rapport-v0.2 titelpagina: live-versie + broncode-URL onder de versie-info
- H7 §7.3 (Implementatie en eerste deploy): productie-URL inline
- H17 bijlage F: URL bij de brede tester-uitnodiging van 29 april

Word-versies regegenereerd voor hoofdstuk 7, 17 en samengevoegd rapport.

Co-Authored-By: Claude Opus 4.7 (1M context) <noreply@anthropic.com>
</commit_message>
<xml_diff>
--- a/docs/onderzoek/word/hoofdstuk-17-bijlagen.docx
+++ b/docs/onderzoek/word/hoofdstuk-17-bijlagen.docx
@@ -34,7 +34,7 @@
         <w:t xml:space="preserve">Mei 2026</w:t>
       </w:r>
     </w:p>
-    <w:bookmarkStart w:id="19" w:name="bijlagen"/>
+    <w:bookmarkStart w:id="20" w:name="bijlagen"/>
     <w:p>
       <w:pPr>
         <w:pStyle w:val="Heading1"/>
@@ -985,7 +985,7 @@
       </w:r>
     </w:p>
     <w:bookmarkEnd w:id="13"/>
-    <w:bookmarkStart w:id="14" w:name="f.-verstuurde-mailcommunicatie"/>
+    <w:bookmarkStart w:id="15" w:name="f.-verstuurde-mailcommunicatie"/>
     <w:p>
       <w:pPr>
         <w:pStyle w:val="Heading2"/>
@@ -1011,8 +1011,19 @@
         <w:t xml:space="preserve"> </w:t>
       </w:r>
       <w:r>
-        <w:t xml:space="preserve">- Brede tester-uitnodiging (29 april 2026) aan ORM-collega’s voor Claude Code-versie</w:t>
-      </w:r>
+        <w:t xml:space="preserve">- Brede tester-uitnodiging (29 april 2026) aan ORM-collega’s voor Claude Code-versie op</w:t>
+      </w:r>
+      <w:r>
+        <w:t xml:space="preserve"> </w:t>
+      </w:r>
+      <w:hyperlink r:id="rId14">
+        <w:r>
+          <w:rPr>
+            <w:rStyle w:val="Hyperlink"/>
+          </w:rPr>
+          <w:t xml:space="preserve">https://ai-nieuws.onrender.com/</w:t>
+        </w:r>
+      </w:hyperlink>
       <w:r>
         <w:t xml:space="preserve"> </w:t>
       </w:r>
@@ -1036,8 +1047,8 @@
         <w:t xml:space="preserve">- Geplande tweede mail (juli/augustus 2026): introductie feedback-knop</w:t>
       </w:r>
     </w:p>
-    <w:bookmarkEnd w:id="14"/>
-    <w:bookmarkStart w:id="15" w:name="X47932e66e20d8cfaa3768fdb18d885a013395c5"/>
+    <w:bookmarkEnd w:id="15"/>
+    <w:bookmarkStart w:id="16" w:name="X47932e66e20d8cfaa3768fdb18d885a013395c5"/>
     <w:p>
       <w:pPr>
         <w:pStyle w:val="Heading2"/>
@@ -1096,8 +1107,8 @@
         <w:t xml:space="preserve">Voor extern publiceerbare versie van het rapport: opnemen na bevestiging dat publicatierechten dit toestaan.</w:t>
       </w:r>
     </w:p>
-    <w:bookmarkEnd w:id="15"/>
-    <w:bookmarkStart w:id="16" w:name="X3d5e1dbf5f37c23378977ae4dd76c44b0f051dc"/>
+    <w:bookmarkEnd w:id="16"/>
+    <w:bookmarkStart w:id="17" w:name="X3d5e1dbf5f37c23378977ae4dd76c44b0f051dc"/>
     <w:p>
       <w:pPr>
         <w:pStyle w:val="Heading2"/>
@@ -1156,8 +1167,8 @@
         <w:t xml:space="preserve">Bronnenlijst van dit essay is gedeeltelijk overgenomen in hoofdstuk 16 (referenties) van dit rapport.</w:t>
       </w:r>
     </w:p>
-    <w:bookmarkEnd w:id="16"/>
-    <w:bookmarkStart w:id="17" w:name="X28615d3b85cb39ee363a782f98ef512c86a0192"/>
+    <w:bookmarkEnd w:id="17"/>
+    <w:bookmarkStart w:id="18" w:name="X28615d3b85cb39ee363a782f98ef512c86a0192"/>
     <w:p>
       <w:pPr>
         <w:pStyle w:val="Heading2"/>
@@ -1227,8 +1238,8 @@
         <w:t xml:space="preserve">- Reflectie op viervoudige rol van auteur (zie hoofdstuk 15 §15.1)</w:t>
       </w:r>
     </w:p>
-    <w:bookmarkEnd w:id="17"/>
-    <w:bookmarkStart w:id="18" w:name="X7a04db56028d1d35952bd7d2572d9d34ec8a3cc"/>
+    <w:bookmarkEnd w:id="18"/>
+    <w:bookmarkStart w:id="19" w:name="X7a04db56028d1d35952bd7d2572d9d34ec8a3cc"/>
     <w:p>
       <w:pPr>
         <w:pStyle w:val="Heading2"/>
@@ -1273,8 +1284,8 @@
         <w:t xml:space="preserve">- Reflectie — viervoudige rol van auteur (zie hoofdstuk 15 §15.1)</w:t>
       </w:r>
     </w:p>
-    <w:bookmarkEnd w:id="18"/>
     <w:bookmarkEnd w:id="19"/>
+    <w:bookmarkEnd w:id="20"/>
     <w:sectPr>
       <w:footnotePr>
         <w:numRestart w:val="eachSect"/>

</xml_diff>